<commit_message>
work session checkpoint 2026-10-14 22:59:41.96
</commit_message>
<xml_diff>
--- a/05_논문작성/v4/지도교수_요약본_v4.docx
+++ b/05_논문작성/v4/지도교수_요약본_v4.docx
@@ -16,6 +16,8 @@
     </w:p>
     <w:p>
       <w:pPr>
+        <w:keepNext w:val="false"/>
+        <w:widowControl/>
         <w:spacing w:after="120" w:before="0" w:line="384"/>
         <w:ind w:firstLine="200"/>
         <w:jc w:val="both"/>
@@ -43,6 +45,8 @@
     </w:p>
     <w:p>
       <w:pPr>
+        <w:keepNext w:val="false"/>
+        <w:widowControl/>
         <w:spacing w:after="120" w:before="0" w:line="384"/>
         <w:ind w:firstLine="200"/>
         <w:jc w:val="both"/>
@@ -94,6 +98,8 @@
     </w:p>
     <w:p>
       <w:pPr>
+        <w:keepNext w:val="false"/>
+        <w:widowControl/>
         <w:spacing w:after="120" w:before="0" w:line="384"/>
         <w:ind w:firstLine="200"/>
         <w:jc w:val="both"/>
@@ -131,6 +137,8 @@
     </w:p>
     <w:p>
       <w:pPr>
+        <w:keepNext/>
+        <w:widowControl/>
         <w:spacing w:after="120" w:before="0" w:line="384"/>
         <w:ind w:firstLine="200"/>
         <w:jc w:val="both"/>
@@ -1370,6 +1378,8 @@
     </w:p>
     <w:p>
       <w:pPr>
+        <w:keepNext w:val="false"/>
+        <w:widowControl/>
         <w:spacing w:after="120" w:before="0" w:line="384"/>
         <w:ind w:firstLine="200"/>
         <w:jc w:val="both"/>
@@ -1455,6 +1465,8 @@
     <w:p>
       <w:pPr>
         <w:pStyle w:val="ListParagraph"/>
+        <w:keepNext/>
+        <w:widowControl/>
         <w:numPr>
           <w:ilvl w:val="0"/>
           <w:numId w:val="2"/>
@@ -1484,6 +1496,8 @@
     <w:p>
       <w:pPr>
         <w:pStyle w:val="ListParagraph"/>
+        <w:keepNext/>
+        <w:widowControl/>
         <w:numPr>
           <w:ilvl w:val="0"/>
           <w:numId w:val="2"/>
@@ -1513,6 +1527,8 @@
     <w:p>
       <w:pPr>
         <w:pStyle w:val="ListParagraph"/>
+        <w:keepNext w:val="false"/>
+        <w:widowControl/>
         <w:numPr>
           <w:ilvl w:val="0"/>
           <w:numId w:val="2"/>
@@ -1613,6 +1629,8 @@
     <w:p>
       <w:pPr>
         <w:pStyle w:val="ListParagraph"/>
+        <w:keepNext/>
+        <w:widowControl/>
         <w:numPr>
           <w:ilvl w:val="0"/>
           <w:numId w:val="2"/>
@@ -1650,6 +1668,8 @@
     <w:p>
       <w:pPr>
         <w:pStyle w:val="ListParagraph"/>
+        <w:keepNext/>
+        <w:widowControl/>
         <w:numPr>
           <w:ilvl w:val="0"/>
           <w:numId w:val="2"/>
@@ -1687,6 +1707,8 @@
     <w:p>
       <w:pPr>
         <w:pStyle w:val="ListParagraph"/>
+        <w:keepNext w:val="false"/>
+        <w:widowControl/>
         <w:numPr>
           <w:ilvl w:val="0"/>
           <w:numId w:val="2"/>
@@ -1783,6 +1805,8 @@
     <w:p>
       <w:pPr>
         <w:pStyle w:val="ListParagraph"/>
+        <w:keepNext/>
+        <w:widowControl/>
         <w:numPr>
           <w:ilvl w:val="0"/>
           <w:numId w:val="2"/>
@@ -1820,6 +1844,8 @@
     <w:p>
       <w:pPr>
         <w:pStyle w:val="ListParagraph"/>
+        <w:keepNext w:val="false"/>
+        <w:widowControl/>
         <w:numPr>
           <w:ilvl w:val="0"/>
           <w:numId w:val="2"/>
@@ -1916,6 +1942,8 @@
     <w:p>
       <w:pPr>
         <w:pStyle w:val="ListParagraph"/>
+        <w:keepNext/>
+        <w:widowControl/>
         <w:numPr>
           <w:ilvl w:val="0"/>
           <w:numId w:val="2"/>
@@ -1953,6 +1981,8 @@
     <w:p>
       <w:pPr>
         <w:pStyle w:val="ListParagraph"/>
+        <w:keepNext/>
+        <w:widowControl/>
         <w:numPr>
           <w:ilvl w:val="0"/>
           <w:numId w:val="2"/>
@@ -1972,6 +2002,8 @@
     <w:p>
       <w:pPr>
         <w:pStyle w:val="ListParagraph"/>
+        <w:keepNext w:val="false"/>
+        <w:widowControl/>
         <w:numPr>
           <w:ilvl w:val="0"/>
           <w:numId w:val="2"/>
@@ -2003,6 +2035,8 @@
     <w:p>
       <w:pPr>
         <w:pStyle w:val="ListParagraph"/>
+        <w:keepNext/>
+        <w:widowControl/>
         <w:numPr>
           <w:ilvl w:val="0"/>
           <w:numId w:val="2"/>
@@ -2032,6 +2066,8 @@
     <w:p>
       <w:pPr>
         <w:pStyle w:val="ListParagraph"/>
+        <w:keepNext w:val="false"/>
+        <w:widowControl/>
         <w:numPr>
           <w:ilvl w:val="0"/>
           <w:numId w:val="2"/>
@@ -2072,6 +2108,8 @@
     </w:p>
     <w:p>
       <w:pPr>
+        <w:keepNext/>
+        <w:widowControl/>
         <w:spacing w:after="120" w:before="0" w:line="384"/>
         <w:ind w:firstLine="200"/>
         <w:jc w:val="both"/>
@@ -2087,6 +2125,8 @@
     </w:p>
     <w:p>
       <w:pPr>
+        <w:keepNext/>
+        <w:widowControl/>
         <w:spacing w:after="60" w:line="384"/>
         <w:ind w:left="360" w:hanging="360"/>
         <w:jc w:val="both"/>
@@ -2102,6 +2142,8 @@
     </w:p>
     <w:p>
       <w:pPr>
+        <w:keepNext w:val="false"/>
+        <w:widowControl/>
         <w:spacing w:after="60" w:line="384"/>
         <w:ind w:left="360" w:hanging="360"/>
         <w:jc w:val="both"/>

</xml_diff>